<commit_message>
docs(interviews): regenerate the Word brief from live render v146
The canonical .docx was locked by Word when #71 was generated, so that PR shipped the corrected .md
and generator only and `--check` correctly reported the Word file as stale. The file is now free and
regenerated from the same payload.

Confirmed: all six disproven phrases absent, the header stamps "render v146 / 2026-08-11", the .md and
.docx agree on every key figure (they share one code path), and `--check` exits 0.

Co-Authored-By: Claude Opus 5 <noreply@anthropic.com>
</commit_message>
<xml_diff>
--- a/docs/FLW_Retention_Analysis_Brief.docx
+++ b/docs/FLW_Retention_Analysis_Brief.docx
@@ -14,30 +14,66 @@
     </w:p>
     <w:p>
       <w:pPr>
-        <w:spacing w:after="20"/>
+        <w:spacing w:after="120"/>
       </w:pPr>
       <w:r>
         <w:rPr>
           <w:b w:val="0"/>
           <w:i/>
           <w:color w:val="6B7280"/>
-          <w:sz w:val="18"/>
+          <w:sz w:val="19"/>
         </w:rPr>
-        <w:t>Connect Interviews program · per-FLW, cross-cohort · data as of 2026-08-07</w:t>
+        <w:t>Connect Interviews programme · per-FLW, cross-cohort · data as of 2026-08-11 · build 2026-08-11 05:47 UTC · dashboard render v146</w:t>
       </w:r>
     </w:p>
     <w:p>
       <w:pPr>
-        <w:spacing w:after="200"/>
+        <w:spacing w:after="120"/>
       </w:pPr>
       <w:r>
         <w:rPr>
           <w:b w:val="0"/>
           <w:i/>
           <w:color w:val="6B7280"/>
-          <w:sz w:val="18"/>
+          <w:sz w:val="19"/>
         </w:rPr>
-        <w:t>Universe: 1,441 unique front-line workers (FLWs) who started ≥ 1 interview · 100% demographic coverage · every metric dedups the worker across all cohorts/arms they were part of. Figures match the live dashboard (FLW Retention tab) — generated from the same data.</w:t>
+        <w:t xml:space="preserve">Universe: </w:t>
+      </w:r>
+      <w:r>
+        <w:rPr>
+          <w:b/>
+          <w:i/>
+          <w:color w:val="6B7280"/>
+          <w:sz w:val="19"/>
+        </w:rPr>
+        <w:t>1,441 unique front-line workers (FLWs)</w:t>
+      </w:r>
+      <w:r>
+        <w:rPr>
+          <w:b w:val="0"/>
+          <w:i/>
+          <w:color w:val="6B7280"/>
+          <w:sz w:val="19"/>
+        </w:rPr>
+        <w:t xml:space="preserve"> who started ≥1 interview · 100% have demographics · every metric dedups the worker across all cohorts/arms they were part of. Generated from the same payload the dashboard's </w:t>
+      </w:r>
+      <w:r>
+        <w:rPr>
+          <w:b/>
+          <w:i/>
+          <w:color w:val="6B7280"/>
+          <w:sz w:val="19"/>
+        </w:rPr>
+        <w:t>FLW Retention</w:t>
+      </w:r>
+      <w:r>
+        <w:rPr>
+          <w:b w:val="0"/>
+          <w:i/>
+          <w:color w:val="6B7280"/>
+          <w:sz w:val="19"/>
+        </w:rPr>
+        <w:t xml:space="preserve"> tab embeds, so every figure here matches what is on screen.</w:t>
       </w:r>
     </w:p>
     <w:p>
@@ -59,210 +95,39 @@
         <w:rPr>
           <w:b w:val="0"/>
         </w:rPr>
-        <w:t>Every other view of this program is cohort-level — how a study arm performed. This one looks at the program through the worker: one row per unique FLW, their interview history stitched across every cohort and arm they touched. That matters because most workers are re-used across studies — so the worker's cumulative experience, not any single cohort, drives whether they stay engaged. This lens tells us who the program retains, when it loses people, and what to do about it.</w:t>
+        <w:t>Every other view of this programme is cohort-level — how a study arm performed. This one looks at the programme through the worker: one row per unique FLW, their interview history stitched across every cohort and arm they touched. Most workers are re-used across studies, so the worker's cumulative experience — not any single cohort — is what tells us who the programme retains and where it loses people.</w:t>
       </w:r>
     </w:p>
     <w:p>
       <w:pPr>
-        <w:pStyle w:val="Heading1"/>
-      </w:pPr>
-      <w:r>
-        <w:rPr>
-          <w:color w:val="1F3864"/>
-        </w:rPr>
-        <w:t>Executive summary</w:t>
-      </w:r>
-    </w:p>
-    <w:p>
-      <w:pPr>
-        <w:pStyle w:val="ListNumber"/>
-        <w:spacing w:after="60"/>
+        <w:spacing w:after="120"/>
       </w:pPr>
       <w:r>
         <w:rPr>
           <w:b w:val="0"/>
+          <w:i/>
+          <w:color w:val="6B7280"/>
+          <w:sz w:val="19"/>
         </w:rPr>
-        <w:t xml:space="preserve">Engagement is fundamentally healthy. </w:t>
+        <w:t xml:space="preserve">Two things to hold on to before the numbers. First, there are </w:t>
       </w:r>
       <w:r>
         <w:rPr>
           <w:b/>
+          <w:i/>
+          <w:color w:val="6B7280"/>
+          <w:sz w:val="19"/>
         </w:rPr>
-        <w:t>78%</w:t>
+        <w:t>two different ways to say a worker "finished"</w:t>
       </w:r>
       <w:r>
         <w:rPr>
           <w:b w:val="0"/>
+          <w:i/>
+          <w:color w:val="6B7280"/>
+          <w:sz w:val="19"/>
         </w:rPr>
-        <w:t xml:space="preserve"> of workers are reliable engagers (</w:t>
-      </w:r>
-      <w:r>
-        <w:rPr>
-          <w:b/>
-        </w:rPr>
-        <w:t>19%</w:t>
-      </w:r>
-      <w:r>
-        <w:rPr>
-          <w:b w:val="0"/>
-        </w:rPr>
-        <w:t xml:space="preserve"> Champions, </w:t>
-      </w:r>
-      <w:r>
-        <w:rPr>
-          <w:b/>
-        </w:rPr>
-        <w:t>59%</w:t>
-      </w:r>
-      <w:r>
-        <w:rPr>
-          <w:b w:val="0"/>
-        </w:rPr>
-        <w:t xml:space="preserve"> Steady finishers). Genuine early loss is small — </w:t>
-      </w:r>
-      <w:r>
-        <w:rPr>
-          <w:b/>
-        </w:rPr>
-        <w:t>9%</w:t>
-      </w:r>
-      <w:r>
-        <w:rPr>
-          <w:b w:val="0"/>
-        </w:rPr>
-        <w:t xml:space="preserve"> one-and-done.</w:t>
-      </w:r>
-    </w:p>
-    <w:p>
-      <w:pPr>
-        <w:pStyle w:val="ListNumber"/>
-        <w:spacing w:after="60"/>
-      </w:pPr>
-      <w:r>
-        <w:rPr>
-          <w:b w:val="0"/>
-        </w:rPr>
-        <w:t xml:space="preserve">Re-using workers is our biggest engagement asset — and it compounds. Finish rate climbs with each additional cohort: </w:t>
-      </w:r>
-      <w:r>
-        <w:rPr>
-          <w:b/>
-        </w:rPr>
-        <w:t>44% → 88%</w:t>
-      </w:r>
-      <w:r>
-        <w:rPr>
-          <w:b w:val="0"/>
-        </w:rPr>
-        <w:t xml:space="preserve"> (single → multi-cohort), and answer depth rises with it (168 → 246 words/session).</w:t>
-      </w:r>
-    </w:p>
-    <w:p>
-      <w:pPr>
-        <w:pStyle w:val="ListNumber"/>
-        <w:spacing w:after="60"/>
-      </w:pPr>
-      <w:r>
-        <w:rPr>
-          <w:b w:val="0"/>
-        </w:rPr>
-        <w:t xml:space="preserve">The drop-off has a clear face. One-and-done workers are disproportionately </w:t>
-      </w:r>
-      <w:r>
-        <w:rPr>
-          <w:b/>
-        </w:rPr>
-        <w:t>Sokoto (49%)</w:t>
-      </w:r>
-      <w:r>
-        <w:rPr>
-          <w:b w:val="0"/>
-        </w:rPr>
-        <w:t xml:space="preserve">, </w:t>
-      </w:r>
-      <w:r>
-        <w:rPr>
-          <w:b/>
-        </w:rPr>
-        <w:t>single-cohort (96%)</w:t>
-      </w:r>
-      <w:r>
-        <w:rPr>
-          <w:b w:val="0"/>
-        </w:rPr>
-        <w:t xml:space="preserve">, and </w:t>
-      </w:r>
-      <w:r>
-        <w:rPr>
-          <w:b/>
-        </w:rPr>
-        <w:t>chew cadre (44%)</w:t>
-      </w:r>
-      <w:r>
-        <w:rPr>
-          <w:b w:val="0"/>
-        </w:rPr>
-        <w:t>.</w:t>
-      </w:r>
-    </w:p>
-    <w:p>
-      <w:pPr>
-        <w:pStyle w:val="ListNumber"/>
-        <w:spacing w:after="60"/>
-      </w:pPr>
-      <w:r>
-        <w:rPr>
-          <w:b w:val="0"/>
-        </w:rPr>
-        <w:t xml:space="preserve">The retention lever is the first interview. Workers with above-median answer depth finish at </w:t>
-      </w:r>
-      <w:r>
-        <w:rPr>
-          <w:b/>
-        </w:rPr>
-        <w:t>88%</w:t>
-      </w:r>
-      <w:r>
-        <w:rPr>
-          <w:b w:val="0"/>
-        </w:rPr>
-        <w:t xml:space="preserve"> vs </w:t>
-      </w:r>
-      <w:r>
-        <w:rPr>
-          <w:b/>
-        </w:rPr>
-        <w:t>68%</w:t>
-      </w:r>
-      <w:r>
-        <w:rPr>
-          <w:b w:val="0"/>
-        </w:rPr>
-        <w:t xml:space="preserve"> below.</w:t>
-      </w:r>
-    </w:p>
-    <w:p>
-      <w:pPr>
-        <w:pStyle w:val="ListNumber"/>
-        <w:spacing w:after="60"/>
-      </w:pPr>
-      <w:r>
-        <w:rPr>
-          <w:b w:val="0"/>
-        </w:rPr>
-        <w:t xml:space="preserve">The recoverable at-risk pool is small and targetable — </w:t>
-      </w:r>
-      <w:r>
-        <w:rPr>
-          <w:b/>
-        </w:rPr>
-        <w:t>51 workers</w:t>
-      </w:r>
-      <w:r>
-        <w:rPr>
-          <w:b w:val="0"/>
-        </w:rPr>
-        <w:t xml:space="preserve"> (started, not finished, silent 14–60 days).</w:t>
+        <w:t>, and they answer different questions (§2). Second, this is observational data: it shows what is associated with finishing, not what causes it.</w:t>
       </w:r>
     </w:p>
     <w:p>
@@ -284,7 +149,7 @@
         <w:rPr>
           <w:b w:val="0"/>
         </w:rPr>
-        <w:t>Behavioral personas (rule-based segments over the worker's whole history):</w:t>
+        <w:t>Behavioural personas — rule-based segments over each worker's whole history:</w:t>
       </w:r>
     </w:p>
     <w:tbl>
@@ -324,7 +189,7 @@
                 <w:b/>
                 <w:sz w:val="19"/>
               </w:rPr>
-              <w:t>Count</w:t>
+              <w:t>Workers</w:t>
             </w:r>
           </w:p>
         </w:tc>
@@ -381,7 +246,7 @@
               <w:rPr>
                 <w:sz w:val="19"/>
               </w:rPr>
-              <w:t>275</w:t>
+              <w:t>276</w:t>
             </w:r>
           </w:p>
         </w:tc>
@@ -407,7 +272,7 @@
               <w:rPr>
                 <w:sz w:val="19"/>
               </w:rPr>
-              <w:t>Finishes, steady cadence, high depth — the backbone</w:t>
+              <w:t>Finishes, steady cadence, high answer depth — the backbone</w:t>
             </w:r>
           </w:p>
         </w:tc>
@@ -436,7 +301,7 @@
               <w:rPr>
                 <w:sz w:val="19"/>
               </w:rPr>
-              <w:t>850</w:t>
+              <w:t>849</w:t>
             </w:r>
           </w:p>
         </w:tc>
@@ -462,7 +327,7 @@
               <w:rPr>
                 <w:sz w:val="19"/>
               </w:rPr>
-              <w:t>Completes their schedule reliably</w:t>
+              <w:t>Completes at least one full schedule reliably</w:t>
             </w:r>
           </w:p>
         </w:tc>
@@ -478,7 +343,7 @@
                 <w:b/>
                 <w:sz w:val="19"/>
               </w:rPr>
-              <w:t>Slow-but-finishing</w:t>
+              <w:t>Partial progress</w:t>
             </w:r>
           </w:p>
         </w:tc>
@@ -491,7 +356,7 @@
               <w:rPr>
                 <w:sz w:val="19"/>
               </w:rPr>
-              <w:t>129</w:t>
+              <w:t>130</w:t>
             </w:r>
           </w:p>
         </w:tc>
@@ -517,7 +382,7 @@
               <w:rPr>
                 <w:sz w:val="19"/>
               </w:rPr>
-              <w:t>Gets there, but with long gaps</w:t>
+              <w:t>Over half their triggered interviews done, but no schedule finished yet</w:t>
             </w:r>
           </w:p>
         </w:tc>
@@ -546,7 +411,7 @@
               <w:rPr>
                 <w:sz w:val="19"/>
               </w:rPr>
-              <w:t>35</w:t>
+              <w:t>34</w:t>
             </w:r>
           </w:p>
         </w:tc>
@@ -682,7 +547,7 @@
               <w:rPr>
                 <w:sz w:val="19"/>
               </w:rPr>
-              <w:t>Started once and stopped — the real early-loss group</w:t>
+              <w:t>Started once and stopped — the genuine early-loss group</w:t>
             </w:r>
           </w:p>
         </w:tc>
@@ -737,7 +602,7 @@
               <w:rPr>
                 <w:sz w:val="19"/>
               </w:rPr>
-              <w:t>Inactive, unfinished</w:t>
+              <w:t>Inactive, nothing finished</w:t>
             </w:r>
           </w:p>
         </w:tc>
@@ -754,9 +619,38 @@
       </w:pPr>
       <w:r>
         <w:rPr>
+          <w:b/>
+        </w:rPr>
+        <w:t>78% have completed at least one full schedule</w:t>
+      </w:r>
+      <w:r>
+        <w:rPr>
           <w:b w:val="0"/>
         </w:rPr>
-        <w:t>Engagement tiers (RFM blend of recency + completion + answer depth): 63% Champion/Solid, 29% Slipping, 8% At-risk/Lost. “Slipping” is largely benign — workers in finished short cohorts who are simply inactive now, not people who quit mid-schedule.</w:t>
+        <w:t xml:space="preserve"> (Champions 19% + Steady finishers 59%). Genuine early loss is </w:t>
+      </w:r>
+      <w:r>
+        <w:rPr>
+          <w:b/>
+        </w:rPr>
+        <w:t>9%</w:t>
+      </w:r>
+      <w:r>
+        <w:rPr>
+          <w:b w:val="0"/>
+        </w:rPr>
+        <w:t xml:space="preserve"> (131 workers) — the One-and-done segment, which §3 profiles.</w:t>
+      </w:r>
+    </w:p>
+    <w:p>
+      <w:pPr>
+        <w:spacing w:after="120"/>
+      </w:pPr>
+      <w:r>
+        <w:rPr>
+          <w:b w:val="0"/>
+        </w:rPr>
+        <w:t>Separately, engagement tiers blend recency, completion rate and answer depth: 61% sit in the top two tiers (Champion 21% + Solid 40%), 31% Slipping, 8% At-risk or Lost. "Slipping" is mixed: it holds both finishers who are simply inactive now and a large share of the one-and-done group, so it should not be read as uniformly benign. Tier recency is measured against the freshest session in the dataset rather than the wall clock, so these shares do not drift when a data pull runs late.</w:t>
       </w:r>
     </w:p>
     <w:p>
@@ -767,7 +661,7 @@
         <w:rPr>
           <w:color w:val="1F3864"/>
         </w:rPr>
-        <w:t>2. The cross-cohort story (the standout finding)</w:t>
+        <w:t>2. Re-use across cohorts — and the measurement trap</w:t>
       </w:r>
     </w:p>
     <w:p>
@@ -778,7 +672,7 @@
         <w:rPr>
           <w:b w:val="0"/>
         </w:rPr>
-        <w:t xml:space="preserve">The multi-arm design re-uses the same workers across studies — </w:t>
+        <w:t xml:space="preserve">The multi-arm design re-uses the same workers across studies: </w:t>
       </w:r>
       <w:r>
         <w:rPr>
@@ -790,7 +684,7 @@
         <w:rPr>
           <w:b w:val="0"/>
         </w:rPr>
-        <w:t xml:space="preserve"> are in ≥2 cohorts. That re-use is the strongest engagement signal we have, and it is monotonic:</w:t>
+        <w:t xml:space="preserve"> are in ≥2 cohorts.</w:t>
       </w:r>
     </w:p>
     <w:tbl>
@@ -956,7 +850,7 @@
               <w:rPr>
                 <w:sz w:val="19"/>
               </w:rPr>
-              <w:t>359</w:t>
+              <w:t>358</w:t>
             </w:r>
           </w:p>
         </w:tc>
@@ -998,7 +892,7 @@
               <w:rPr>
                 <w:sz w:val="19"/>
               </w:rPr>
-              <w:t>136</w:t>
+              <w:t>137</w:t>
             </w:r>
           </w:p>
         </w:tc>
@@ -1011,7 +905,7 @@
               <w:rPr>
                 <w:sz w:val="19"/>
               </w:rPr>
-              <w:t>9%</w:t>
+              <w:t>10%</w:t>
             </w:r>
           </w:p>
         </w:tc>
@@ -1106,99 +1000,6 @@
         <w:spacing w:after="40"/>
       </w:pPr>
     </w:p>
-    <w:p>
-      <w:pPr>
-        <w:spacing w:after="120"/>
-      </w:pPr>
-      <w:r>
-        <w:rPr>
-          <w:b w:val="0"/>
-        </w:rPr>
-        <w:t xml:space="preserve">Comparing single- vs multi-cohort workers: completion is flat (0.88 vs 0.89) while </w:t>
-      </w:r>
-      <w:r>
-        <w:rPr>
-          <w:b/>
-        </w:rPr>
-        <w:t>finishing rises 44% → 88%</w:t>
-      </w:r>
-      <w:r>
-        <w:rPr>
-          <w:b w:val="0"/>
-        </w:rPr>
-        <w:t xml:space="preserve"> and </w:t>
-      </w:r>
-      <w:r>
-        <w:rPr>
-          <w:b/>
-        </w:rPr>
-        <w:t>depth rises 168 → 246 words/session</w:t>
-      </w:r>
-      <w:r>
-        <w:rPr>
-          <w:b w:val="0"/>
-        </w:rPr>
-        <w:t xml:space="preserve"> — repeat exposure builds commitment and richer engagement, with no sign of fatigue.</w:t>
-      </w:r>
-    </w:p>
-    <w:p>
-      <w:pPr>
-        <w:spacing w:after="120"/>
-      </w:pPr>
-      <w:r>
-        <w:rPr>
-          <w:b w:val="0"/>
-        </w:rPr>
-        <w:t>Structurally, TRS is the gateway: almost every multi-arm worker started in Training (TRS) and was re-used into study arms — top combinations: PANEL|TRS (322), 2WT|ABT1-B|TRS (87), 2WT|ABT2-A|TRS (71), 2WT|ABT2-B|EXT|TRS (70). TRS is the program's on-ramp; workers who flow from it into further arms become the most engaged core.</w:t>
-      </w:r>
-    </w:p>
-    <w:p>
-      <w:pPr>
-        <w:spacing w:after="120"/>
-      </w:pPr>
-      <w:r>
-        <w:rPr>
-          <w:b w:val="0"/>
-        </w:rPr>
-        <w:t>Implication: a stable, repeatedly-engaged worker panel is a competitive asset — deliberately re-invite proven workers rather than defaulting to fresh single-exposure recruitment.</w:t>
-      </w:r>
-    </w:p>
-    <w:p>
-      <w:pPr>
-        <w:spacing w:after="120"/>
-      </w:pPr>
-      <w:r>
-        <w:rPr>
-          <w:b w:val="0"/>
-          <w:i/>
-          <w:color w:val="6B7280"/>
-          <w:sz w:val="18"/>
-        </w:rPr>
-        <w:t>(Caveat: the raw “finished” share is partly mechanical for multi-cohort workers — more cohorts = more chances to finish one — so completion and depth, which aren't subject to that bias, carry the cleaner signal; they agree.)</w:t>
-      </w:r>
-    </w:p>
-    <w:p>
-      <w:pPr>
-        <w:pStyle w:val="Heading1"/>
-      </w:pPr>
-      <w:r>
-        <w:rPr>
-          <w:color w:val="1F3864"/>
-        </w:rPr>
-        <w:t>3. Where the program loses people — and who they are</w:t>
-      </w:r>
-    </w:p>
-    <w:p>
-      <w:pPr>
-        <w:spacing w:after="120"/>
-      </w:pPr>
-      <w:r>
-        <w:rPr>
-          <w:b w:val="0"/>
-        </w:rPr>
-        <w:t>Genuine early loss is the One-and-done segment (131 workers, 9%). They are not a random slice:</w:t>
-      </w:r>
-    </w:p>
     <w:tbl>
       <w:tblPr>
         <w:tblStyle w:val="LightGrid-Accent1"/>
@@ -1206,14 +1007,15 @@
         <w:tblLook w:firstColumn="1" w:firstRow="1" w:lastColumn="0" w:lastRow="0" w:noHBand="0" w:noVBand="1" w:val="04A0"/>
       </w:tblPr>
       <w:tblGrid>
-        <w:gridCol w:w="2880"/>
-        <w:gridCol w:w="2880"/>
-        <w:gridCol w:w="2880"/>
+        <w:gridCol w:w="2160"/>
+        <w:gridCol w:w="2160"/>
+        <w:gridCol w:w="2160"/>
+        <w:gridCol w:w="2160"/>
       </w:tblGrid>
       <w:tr>
         <w:tc>
           <w:tcPr>
-            <w:tcW w:type="dxa" w:w="2880"/>
+            <w:tcW w:type="dxa" w:w="2160"/>
           </w:tcPr>
           <w:p>
             <w:r>
@@ -1221,13 +1023,13 @@
                 <w:b/>
                 <w:sz w:val="19"/>
               </w:rPr>
-              <w:t>Cut</w:t>
+              <w:t>Measure</w:t>
             </w:r>
           </w:p>
         </w:tc>
         <w:tc>
           <w:tcPr>
-            <w:tcW w:type="dxa" w:w="2880"/>
+            <w:tcW w:type="dxa" w:w="2160"/>
           </w:tcPr>
           <w:p>
             <w:r>
@@ -1235,13 +1037,13 @@
                 <w:b/>
                 <w:sz w:val="19"/>
               </w:rPr>
-              <w:t>One-and-done</w:t>
+              <w:t>Single-cohort workers</w:t>
             </w:r>
           </w:p>
         </w:tc>
         <w:tc>
           <w:tcPr>
-            <w:tcW w:type="dxa" w:w="2880"/>
+            <w:tcW w:type="dxa" w:w="2160"/>
           </w:tcPr>
           <w:p>
             <w:r>
@@ -1249,7 +1051,21 @@
                 <w:b/>
                 <w:sz w:val="19"/>
               </w:rPr>
-              <w:t>Program overall</w:t>
+              <w:t>Multi-cohort workers</w:t>
+            </w:r>
+          </w:p>
+        </w:tc>
+        <w:tc>
+          <w:tcPr>
+            <w:tcW w:type="dxa" w:w="2160"/>
+          </w:tcPr>
+          <w:p>
+            <w:r>
+              <w:rPr>
+                <w:b/>
+                <w:sz w:val="19"/>
+              </w:rPr>
+              <w:t>What it asks</w:t>
             </w:r>
           </w:p>
         </w:tc>
@@ -1257,7 +1073,7 @@
       <w:tr>
         <w:tc>
           <w:tcPr>
-            <w:tcW w:type="dxa" w:w="2880"/>
+            <w:tcW w:type="dxa" w:w="2160"/>
           </w:tcPr>
           <w:p>
             <w:r>
@@ -1265,97 +1081,13 @@
                 <w:b/>
                 <w:sz w:val="19"/>
               </w:rPr>
-              <w:t>Sokoto (top state)</w:t>
+              <w:t>Finished ≥1 schedule</w:t>
             </w:r>
           </w:p>
         </w:tc>
         <w:tc>
           <w:tcPr>
-            <w:tcW w:type="dxa" w:w="2880"/>
-          </w:tcPr>
-          <w:p>
-            <w:r>
-              <w:rPr>
-                <w:sz w:val="19"/>
-              </w:rPr>
-              <w:t>49%</w:t>
-            </w:r>
-          </w:p>
-        </w:tc>
-        <w:tc>
-          <w:tcPr>
-            <w:tcW w:type="dxa" w:w="2880"/>
-          </w:tcPr>
-          <w:p>
-            <w:r>
-              <w:rPr>
-                <w:sz w:val="19"/>
-              </w:rPr>
-              <w:t>291 workers</w:t>
-            </w:r>
-          </w:p>
-        </w:tc>
-      </w:tr>
-      <w:tr>
-        <w:tc>
-          <w:tcPr>
-            <w:tcW w:type="dxa" w:w="2880"/>
-          </w:tcPr>
-          <w:p>
-            <w:r>
-              <w:rPr>
-                <w:b/>
-                <w:sz w:val="19"/>
-              </w:rPr>
-              <w:t>Single-cohort</w:t>
-            </w:r>
-          </w:p>
-        </w:tc>
-        <w:tc>
-          <w:tcPr>
-            <w:tcW w:type="dxa" w:w="2880"/>
-          </w:tcPr>
-          <w:p>
-            <w:r>
-              <w:rPr>
-                <w:sz w:val="19"/>
-              </w:rPr>
-              <w:t>96%</w:t>
-            </w:r>
-          </w:p>
-        </w:tc>
-        <w:tc>
-          <w:tcPr>
-            <w:tcW w:type="dxa" w:w="2880"/>
-          </w:tcPr>
-          <w:p>
-            <w:r>
-              <w:rPr>
-                <w:sz w:val="19"/>
-              </w:rPr>
-              <w:t>23%</w:t>
-            </w:r>
-          </w:p>
-        </w:tc>
-      </w:tr>
-      <w:tr>
-        <w:tc>
-          <w:tcPr>
-            <w:tcW w:type="dxa" w:w="2880"/>
-          </w:tcPr>
-          <w:p>
-            <w:r>
-              <w:rPr>
-                <w:b/>
-                <w:sz w:val="19"/>
-              </w:rPr>
-              <w:t>chew cadre (top)</w:t>
-            </w:r>
-          </w:p>
-        </w:tc>
-        <w:tc>
-          <w:tcPr>
-            <w:tcW w:type="dxa" w:w="2880"/>
+            <w:tcW w:type="dxa" w:w="2160"/>
           </w:tcPr>
           <w:p>
             <w:r>
@@ -1368,13 +1100,27 @@
         </w:tc>
         <w:tc>
           <w:tcPr>
-            <w:tcW w:type="dxa" w:w="2880"/>
+            <w:tcW w:type="dxa" w:w="2160"/>
           </w:tcPr>
           <w:p>
             <w:r>
               <w:rPr>
                 <w:sz w:val="19"/>
               </w:rPr>
+              <w:t>88%</w:t>
+            </w:r>
+          </w:p>
+        </w:tc>
+        <w:tc>
+          <w:tcPr>
+            <w:tcW w:type="dxa" w:w="2160"/>
+          </w:tcPr>
+          <w:p>
+            <w:r>
+              <w:rPr>
+                <w:sz w:val="19"/>
+              </w:rPr>
+              <w:t>Have they ever completed anything?</w:t>
             </w:r>
           </w:p>
         </w:tc>
@@ -1382,7 +1128,7 @@
       <w:tr>
         <w:tc>
           <w:tcPr>
-            <w:tcW w:type="dxa" w:w="2880"/>
+            <w:tcW w:type="dxa" w:w="2160"/>
           </w:tcPr>
           <w:p>
             <w:r>
@@ -1390,33 +1136,210 @@
                 <w:b/>
                 <w:sz w:val="19"/>
               </w:rPr>
-              <w:t>Median answer depth</w:t>
+              <w:t>Per-cohort finish rate</w:t>
             </w:r>
           </w:p>
         </w:tc>
         <w:tc>
           <w:tcPr>
-            <w:tcW w:type="dxa" w:w="2880"/>
+            <w:tcW w:type="dxa" w:w="2160"/>
           </w:tcPr>
           <w:p>
             <w:r>
               <w:rPr>
                 <w:sz w:val="19"/>
               </w:rPr>
-              <w:t>112 words</w:t>
+              <w:t>44%</w:t>
             </w:r>
           </w:p>
         </w:tc>
         <w:tc>
           <w:tcPr>
-            <w:tcW w:type="dxa" w:w="2880"/>
+            <w:tcW w:type="dxa" w:w="2160"/>
           </w:tcPr>
           <w:p>
             <w:r>
               <w:rPr>
                 <w:sz w:val="19"/>
               </w:rPr>
-              <w:t>Champions: 181</w:t>
+              <w:t>62%</w:t>
+            </w:r>
+          </w:p>
+        </w:tc>
+        <w:tc>
+          <w:tcPr>
+            <w:tcW w:type="dxa" w:w="2160"/>
+          </w:tcPr>
+          <w:p>
+            <w:r>
+              <w:rPr>
+                <w:sz w:val="19"/>
+              </w:rPr>
+              <w:t>Of the schedules they were given, how many did they complete?</w:t>
+            </w:r>
+          </w:p>
+        </w:tc>
+      </w:tr>
+      <w:tr>
+        <w:tc>
+          <w:tcPr>
+            <w:tcW w:type="dxa" w:w="2160"/>
+          </w:tcPr>
+          <w:p>
+            <w:r>
+              <w:rPr>
+                <w:b/>
+                <w:sz w:val="19"/>
+              </w:rPr>
+              <w:t>Completion rate</w:t>
+            </w:r>
+          </w:p>
+        </w:tc>
+        <w:tc>
+          <w:tcPr>
+            <w:tcW w:type="dxa" w:w="2160"/>
+          </w:tcPr>
+          <w:p>
+            <w:r>
+              <w:rPr>
+                <w:sz w:val="19"/>
+              </w:rPr>
+              <w:t>0.88</w:t>
+            </w:r>
+          </w:p>
+        </w:tc>
+        <w:tc>
+          <w:tcPr>
+            <w:tcW w:type="dxa" w:w="2160"/>
+          </w:tcPr>
+          <w:p>
+            <w:r>
+              <w:rPr>
+                <w:sz w:val="19"/>
+              </w:rPr>
+              <w:t>0.89</w:t>
+            </w:r>
+          </w:p>
+        </w:tc>
+        <w:tc>
+          <w:tcPr>
+            <w:tcW w:type="dxa" w:w="2160"/>
+          </w:tcPr>
+          <w:p>
+            <w:r>
+              <w:rPr>
+                <w:sz w:val="19"/>
+              </w:rPr>
+              <w:t>Of interviews they were sent, how many did they finish?</w:t>
+            </w:r>
+          </w:p>
+        </w:tc>
+      </w:tr>
+      <w:tr>
+        <w:tc>
+          <w:tcPr>
+            <w:tcW w:type="dxa" w:w="2160"/>
+          </w:tcPr>
+          <w:p>
+            <w:r>
+              <w:rPr>
+                <w:b/>
+                <w:sz w:val="19"/>
+              </w:rPr>
+              <w:t>Answer depth</w:t>
+            </w:r>
+          </w:p>
+        </w:tc>
+        <w:tc>
+          <w:tcPr>
+            <w:tcW w:type="dxa" w:w="2160"/>
+          </w:tcPr>
+          <w:p>
+            <w:r>
+              <w:rPr>
+                <w:sz w:val="19"/>
+              </w:rPr>
+              <w:t>168 words/session</w:t>
+            </w:r>
+          </w:p>
+        </w:tc>
+        <w:tc>
+          <w:tcPr>
+            <w:tcW w:type="dxa" w:w="2160"/>
+          </w:tcPr>
+          <w:p>
+            <w:r>
+              <w:rPr>
+                <w:sz w:val="19"/>
+              </w:rPr>
+              <w:t>245 words/session</w:t>
+            </w:r>
+          </w:p>
+        </w:tc>
+        <w:tc>
+          <w:tcPr>
+            <w:tcW w:type="dxa" w:w="2160"/>
+          </w:tcPr>
+          <w:p>
+            <w:r>
+              <w:rPr>
+                <w:sz w:val="19"/>
+              </w:rPr>
+              <w:t>How much do they actually say?</w:t>
+            </w:r>
+          </w:p>
+        </w:tc>
+      </w:tr>
+      <w:tr>
+        <w:tc>
+          <w:tcPr>
+            <w:tcW w:type="dxa" w:w="2160"/>
+          </w:tcPr>
+          <w:p>
+            <w:r>
+              <w:rPr>
+                <w:b/>
+                <w:sz w:val="19"/>
+              </w:rPr>
+              <w:t>Workers</w:t>
+            </w:r>
+          </w:p>
+        </w:tc>
+        <w:tc>
+          <w:tcPr>
+            <w:tcW w:type="dxa" w:w="2160"/>
+          </w:tcPr>
+          <w:p>
+            <w:r>
+              <w:rPr>
+                <w:sz w:val="19"/>
+              </w:rPr>
+              <w:t>332</w:t>
+            </w:r>
+          </w:p>
+        </w:tc>
+        <w:tc>
+          <w:tcPr>
+            <w:tcW w:type="dxa" w:w="2160"/>
+          </w:tcPr>
+          <w:p>
+            <w:r>
+              <w:rPr>
+                <w:sz w:val="19"/>
+              </w:rPr>
+              <w:t>1,109</w:t>
+            </w:r>
+          </w:p>
+        </w:tc>
+        <w:tc>
+          <w:tcPr>
+            <w:tcW w:type="dxa" w:w="2160"/>
+          </w:tcPr>
+          <w:p>
+            <w:r>
+              <w:rPr>
+                <w:sz w:val="19"/>
+              </w:rPr>
             </w:r>
           </w:p>
         </w:tc>
@@ -1435,7 +1358,43 @@
         <w:rPr>
           <w:b w:val="0"/>
         </w:rPr>
-        <w:t>The drop-off profile is a first-time, single-exposure worker (top geography above), engaging shallowly on their one interview and not returning. This points at who to support and when — at/just after the first interview.</w:t>
+        <w:t xml:space="preserve">The first row is the trap. "Finished ≥1 schedule" is a </w:t>
+      </w:r>
+      <w:r>
+        <w:rPr>
+          <w:b/>
+        </w:rPr>
+        <w:t>maximum over a worker's cohorts</w:t>
+      </w:r>
+      <w:r>
+        <w:rPr>
+          <w:b w:val="0"/>
+        </w:rPr>
+        <w:t xml:space="preserve"> — a worker in three cohorts gets three independent chances to clear the bar — so it rises with cohort count even if nothing about the worker changed. It shows a 44-point gap. On the like-for-like measure, the gap is </w:t>
+      </w:r>
+      <w:r>
+        <w:rPr>
+          <w:b/>
+        </w:rPr>
+        <w:t>18 points</w:t>
+      </w:r>
+      <w:r>
+        <w:rPr>
+          <w:b w:val="0"/>
+        </w:rPr>
+        <w:t xml:space="preserve"> (44% vs 62%), so roughly </w:t>
+      </w:r>
+      <w:r>
+        <w:rPr>
+          <w:b/>
+        </w:rPr>
+        <w:t>59% of the headline gap is arithmetic rather than behaviour</w:t>
+      </w:r>
+      <w:r>
+        <w:rPr>
+          <w:b w:val="0"/>
+        </w:rPr>
+        <w:t>.</w:t>
       </w:r>
     </w:p>
     <w:p>
@@ -1446,7 +1405,44 @@
         <w:rPr>
           <w:b w:val="0"/>
         </w:rPr>
-        <w:t>The depth curve (share reaching each interview: Int≥1 100% → Int≥2 88% → Int≥3 62%) partly reflects cohort schedule length — most workers are in short cohorts, so deeper steps largely mean “was this worker in a longer-schedule cohort,” not attrition. The clean FLW-level attrition number is the 9% one-and-done.</w:t>
+        <w:t xml:space="preserve">What re-used workers clearly do differ on is </w:t>
+      </w:r>
+      <w:r>
+        <w:rPr>
+          <w:b/>
+        </w:rPr>
+        <w:t>depth: 168 → 245 words/session</w:t>
+      </w:r>
+      <w:r>
+        <w:rPr>
+          <w:b w:val="0"/>
+        </w:rPr>
+        <w:t>, while completion rate is essentially unchanged (0.88 vs 0.89).</w:t>
+      </w:r>
+    </w:p>
+    <w:p>
+      <w:pPr>
+        <w:spacing w:after="120"/>
+      </w:pPr>
+      <w:r>
+        <w:rPr>
+          <w:b w:val="0"/>
+          <w:i/>
+          <w:color w:val="6B7280"/>
+          <w:sz w:val="19"/>
+        </w:rPr>
+        <w:t>Causal caution: being re-invited is itself an outcome of how a worker performed the first time, so even the residual difference is not evidence that re-using a worker causes them to finish more. Re-use is operationally valuable — these are known, trained, available workers who answer at greater length — but do not budget for a finish-rate gain from re-use itself.</w:t>
+      </w:r>
+    </w:p>
+    <w:p>
+      <w:pPr>
+        <w:spacing w:after="120"/>
+      </w:pPr>
+      <w:r>
+        <w:rPr>
+          <w:b w:val="0"/>
+        </w:rPr>
+        <w:t>Most common arm combinations: PANEL|TRS (322), 2WT|ABT1-B|TRS (87), 2WT|ABT2-B|EXT|TRS (70), 2WT|ABT2-B|TRS (70). (The arm set is unordered in this data, so we can say which arms co-occur, not which came first.)</w:t>
       </w:r>
     </w:p>
     <w:p>
@@ -1457,7 +1453,7 @@
         <w:rPr>
           <w:color w:val="1F3864"/>
         </w:rPr>
-        <w:t>4. The retention lever: early engagement depth</w:t>
+        <w:t>3. Where the programme loses people — and who they are</w:t>
       </w:r>
     </w:p>
     <w:p>
@@ -1468,7 +1464,19 @@
         <w:rPr>
           <w:b w:val="0"/>
         </w:rPr>
-        <w:t>Splitting the population at the median answer-depth:</w:t>
+        <w:t xml:space="preserve">Genuine early loss is the One-and-done segment: </w:t>
+      </w:r>
+      <w:r>
+        <w:rPr>
+          <w:b/>
+        </w:rPr>
+        <w:t>131 workers (9%)</w:t>
+      </w:r>
+      <w:r>
+        <w:rPr>
+          <w:b w:val="0"/>
+        </w:rPr>
+        <w:t xml:space="preserve"> who started exactly one interview and never returned. They are not a random slice. Each row below compares the segment against that group's share of the whole population, so a share is only notable if it exceeds the base rate:</w:t>
       </w:r>
     </w:p>
     <w:tbl>
@@ -1494,7 +1502,7 @@
                 <w:b/>
                 <w:sz w:val="19"/>
               </w:rPr>
-              <w:t>Group</w:t>
+              <w:t>Cut</w:t>
             </w:r>
           </w:p>
         </w:tc>
@@ -1508,7 +1516,7 @@
                 <w:b/>
                 <w:sz w:val="19"/>
               </w:rPr>
-              <w:t>Workers</w:t>
+              <w:t>One-and-done</w:t>
             </w:r>
           </w:p>
         </w:tc>
@@ -1522,7 +1530,7 @@
                 <w:b/>
                 <w:sz w:val="19"/>
               </w:rPr>
-              <w:t>Finish rate</w:t>
+              <w:t>Programme base rate</w:t>
             </w:r>
           </w:p>
         </w:tc>
@@ -1536,7 +1544,7 @@
                 <w:b/>
                 <w:sz w:val="19"/>
               </w:rPr>
-              <w:t>Avg depth</w:t>
+              <w:t>Over-represented</w:t>
             </w:r>
           </w:p>
         </w:tc>
@@ -1552,7 +1560,7 @@
                 <w:b/>
                 <w:sz w:val="19"/>
               </w:rPr>
-              <w:t>Above-median depth</w:t>
+              <w:t>Sokoto (top state)</w:t>
             </w:r>
           </w:p>
         </w:tc>
@@ -1565,7 +1573,7 @@
               <w:rPr>
                 <w:sz w:val="19"/>
               </w:rPr>
-              <w:t>721</w:t>
+              <w:t>49%</w:t>
             </w:r>
           </w:p>
         </w:tc>
@@ -1578,7 +1586,7 @@
               <w:rPr>
                 <w:sz w:val="19"/>
               </w:rPr>
-              <w:t>88%</w:t>
+              <w:t>20%</w:t>
             </w:r>
           </w:p>
         </w:tc>
@@ -1591,7 +1599,7 @@
               <w:rPr>
                 <w:sz w:val="19"/>
               </w:rPr>
-              <w:t>323 words/session</w:t>
+              <w:t>×2.5</w:t>
             </w:r>
           </w:p>
         </w:tc>
@@ -1607,7 +1615,7 @@
                 <w:b/>
                 <w:sz w:val="19"/>
               </w:rPr>
-              <w:t>Below-median depth</w:t>
+              <w:t>Single-cohort</w:t>
             </w:r>
           </w:p>
         </w:tc>
@@ -1620,7 +1628,7 @@
               <w:rPr>
                 <w:sz w:val="19"/>
               </w:rPr>
-              <w:t>720</w:t>
+              <w:t>96%</w:t>
             </w:r>
           </w:p>
         </w:tc>
@@ -1633,7 +1641,7 @@
               <w:rPr>
                 <w:sz w:val="19"/>
               </w:rPr>
-              <w:t>68%</w:t>
+              <w:t>23%</w:t>
             </w:r>
           </w:p>
         </w:tc>
@@ -1646,7 +1654,116 @@
               <w:rPr>
                 <w:sz w:val="19"/>
               </w:rPr>
-              <w:t>133 words/session</w:t>
+              <w:t>×4.2</w:t>
+            </w:r>
+          </w:p>
+        </w:tc>
+      </w:tr>
+      <w:tr>
+        <w:tc>
+          <w:tcPr>
+            <w:tcW w:type="dxa" w:w="2160"/>
+          </w:tcPr>
+          <w:p>
+            <w:r>
+              <w:rPr>
+                <w:b/>
+                <w:sz w:val="19"/>
+              </w:rPr>
+              <w:t>chew (top cadre)</w:t>
+            </w:r>
+          </w:p>
+        </w:tc>
+        <w:tc>
+          <w:tcPr>
+            <w:tcW w:type="dxa" w:w="2160"/>
+          </w:tcPr>
+          <w:p>
+            <w:r>
+              <w:rPr>
+                <w:sz w:val="19"/>
+              </w:rPr>
+              <w:t>44%</w:t>
+            </w:r>
+          </w:p>
+        </w:tc>
+        <w:tc>
+          <w:tcPr>
+            <w:tcW w:type="dxa" w:w="2160"/>
+          </w:tcPr>
+          <w:p>
+            <w:r>
+              <w:rPr>
+                <w:sz w:val="19"/>
+              </w:rPr>
+              <w:t>39%</w:t>
+            </w:r>
+          </w:p>
+        </w:tc>
+        <w:tc>
+          <w:tcPr>
+            <w:tcW w:type="dxa" w:w="2160"/>
+          </w:tcPr>
+          <w:p>
+            <w:r>
+              <w:rPr>
+                <w:sz w:val="19"/>
+              </w:rPr>
+              <w:t>×1.1</w:t>
+            </w:r>
+          </w:p>
+        </w:tc>
+      </w:tr>
+      <w:tr>
+        <w:tc>
+          <w:tcPr>
+            <w:tcW w:type="dxa" w:w="2160"/>
+          </w:tcPr>
+          <w:p>
+            <w:r>
+              <w:rPr>
+                <w:b/>
+                <w:sz w:val="19"/>
+              </w:rPr>
+              <w:t>Median first-session depth</w:t>
+            </w:r>
+          </w:p>
+        </w:tc>
+        <w:tc>
+          <w:tcPr>
+            <w:tcW w:type="dxa" w:w="2160"/>
+          </w:tcPr>
+          <w:p>
+            <w:r>
+              <w:rPr>
+                <w:sz w:val="19"/>
+              </w:rPr>
+              <w:t>112 words</w:t>
+            </w:r>
+          </w:p>
+        </w:tc>
+        <w:tc>
+          <w:tcPr>
+            <w:tcW w:type="dxa" w:w="2160"/>
+          </w:tcPr>
+          <w:p>
+            <w:r>
+              <w:rPr>
+                <w:sz w:val="19"/>
+              </w:rPr>
+              <w:t>123 words (all workers)</w:t>
+            </w:r>
+          </w:p>
+        </w:tc>
+        <w:tc>
+          <w:tcPr>
+            <w:tcW w:type="dxa" w:w="2160"/>
+          </w:tcPr>
+          <w:p>
+            <w:r>
+              <w:rPr>
+                <w:sz w:val="19"/>
+              </w:rPr>
             </w:r>
           </w:p>
         </w:tc>
@@ -1665,7 +1782,30 @@
         <w:rPr>
           <w:b w:val="0"/>
         </w:rPr>
-        <w:t>A 20-point finish gap tracks with how deeply a worker engages early — consistent with the longitudinal-survey literature. The highest-leverage intervention is making the first interview(s) genuinely engaging (prompt design, length, onboarding support).</w:t>
+        <w:t>Read together, the drop-off profile is a first-time, single-exposure worker in one geography, engaging shallowly on their single interview and not returning.</w:t>
+      </w:r>
+    </w:p>
+    <w:p>
+      <w:pPr>
+        <w:spacing w:after="120"/>
+      </w:pPr>
+      <w:r>
+        <w:rPr>
+          <w:b w:val="0"/>
+        </w:rPr>
+        <w:t xml:space="preserve">On how far workers get: of those whose schedule even *contains* interview 3, </w:t>
+      </w:r>
+      <w:r>
+        <w:rPr>
+          <w:b/>
+        </w:rPr>
+        <w:t>86%</w:t>
+      </w:r>
+      <w:r>
+        <w:rPr>
+          <w:b w:val="0"/>
+        </w:rPr>
+        <w:t xml:space="preserve"> reach it (893 of 1,038). Quoting it against the whole population instead gives 62%, which understates retention because most workers are in short cohorts that stop before interview 3 — that is schedule length, not attrition. The clean worker-level attrition figure is the 9% one-and-done.</w:t>
       </w:r>
     </w:p>
     <w:p>
@@ -1676,7 +1816,7 @@
         <w:rPr>
           <w:color w:val="1F3864"/>
         </w:rPr>
-        <w:t>5. Cross-cuts: geography, partner, cadre</w:t>
+        <w:t>4. Does early answer depth predict finishing?</w:t>
       </w:r>
     </w:p>
     <w:p>
@@ -1687,7 +1827,19 @@
         <w:rPr>
           <w:b w:val="0"/>
         </w:rPr>
-        <w:t>By state:</w:t>
+        <w:t xml:space="preserve">Splitting workers at the median depth of their </w:t>
+      </w:r>
+      <w:r>
+        <w:rPr>
+          <w:b/>
+        </w:rPr>
+        <w:t>first session only</w:t>
+      </w:r>
+      <w:r>
+        <w:rPr>
+          <w:b w:val="0"/>
+        </w:rPr>
+        <w:t xml:space="preserve"> (123 words) — first session, so the predictor does not contain the outcome:</w:t>
       </w:r>
     </w:p>
     <w:tbl>
@@ -1697,14 +1849,289 @@
         <w:tblLook w:firstColumn="1" w:firstRow="1" w:lastColumn="0" w:lastRow="0" w:noHBand="0" w:noVBand="1" w:val="04A0"/>
       </w:tblPr>
       <w:tblGrid>
-        <w:gridCol w:w="2880"/>
-        <w:gridCol w:w="2880"/>
-        <w:gridCol w:w="2880"/>
+        <w:gridCol w:w="1728"/>
+        <w:gridCol w:w="1728"/>
+        <w:gridCol w:w="1728"/>
+        <w:gridCol w:w="1728"/>
+        <w:gridCol w:w="1728"/>
       </w:tblGrid>
       <w:tr>
         <w:tc>
           <w:tcPr>
-            <w:tcW w:type="dxa" w:w="2880"/>
+            <w:tcW w:type="dxa" w:w="1728"/>
+          </w:tcPr>
+          <w:p>
+            <w:r>
+              <w:rPr>
+                <w:b/>
+                <w:sz w:val="19"/>
+              </w:rPr>
+              <w:t>Group</w:t>
+            </w:r>
+          </w:p>
+        </w:tc>
+        <w:tc>
+          <w:tcPr>
+            <w:tcW w:type="dxa" w:w="1728"/>
+          </w:tcPr>
+          <w:p>
+            <w:r>
+              <w:rPr>
+                <w:b/>
+                <w:sz w:val="19"/>
+              </w:rPr>
+              <w:t>Workers</w:t>
+            </w:r>
+          </w:p>
+        </w:tc>
+        <w:tc>
+          <w:tcPr>
+            <w:tcW w:type="dxa" w:w="1728"/>
+          </w:tcPr>
+          <w:p>
+            <w:r>
+              <w:rPr>
+                <w:b/>
+                <w:sz w:val="19"/>
+              </w:rPr>
+              <w:t>Per-cohort finish rate</w:t>
+            </w:r>
+          </w:p>
+        </w:tc>
+        <w:tc>
+          <w:tcPr>
+            <w:tcW w:type="dxa" w:w="1728"/>
+          </w:tcPr>
+          <w:p>
+            <w:r>
+              <w:rPr>
+                <w:b/>
+                <w:sz w:val="19"/>
+              </w:rPr>
+              <w:t>Finished ≥1 schedule</w:t>
+            </w:r>
+          </w:p>
+        </w:tc>
+        <w:tc>
+          <w:tcPr>
+            <w:tcW w:type="dxa" w:w="1728"/>
+          </w:tcPr>
+          <w:p>
+            <w:r>
+              <w:rPr>
+                <w:b/>
+                <w:sz w:val="19"/>
+              </w:rPr>
+              <w:t>First-session depth</w:t>
+            </w:r>
+          </w:p>
+        </w:tc>
+      </w:tr>
+      <w:tr>
+        <w:tc>
+          <w:tcPr>
+            <w:tcW w:type="dxa" w:w="1728"/>
+          </w:tcPr>
+          <w:p>
+            <w:r>
+              <w:rPr>
+                <w:b/>
+                <w:sz w:val="19"/>
+              </w:rPr>
+              <w:t>Above-median depth</w:t>
+            </w:r>
+          </w:p>
+        </w:tc>
+        <w:tc>
+          <w:tcPr>
+            <w:tcW w:type="dxa" w:w="1728"/>
+          </w:tcPr>
+          <w:p>
+            <w:r>
+              <w:rPr>
+                <w:sz w:val="19"/>
+              </w:rPr>
+              <w:t>725</w:t>
+            </w:r>
+          </w:p>
+        </w:tc>
+        <w:tc>
+          <w:tcPr>
+            <w:tcW w:type="dxa" w:w="1728"/>
+          </w:tcPr>
+          <w:p>
+            <w:r>
+              <w:rPr>
+                <w:sz w:val="19"/>
+              </w:rPr>
+              <w:t>61%</w:t>
+            </w:r>
+          </w:p>
+        </w:tc>
+        <w:tc>
+          <w:tcPr>
+            <w:tcW w:type="dxa" w:w="1728"/>
+          </w:tcPr>
+          <w:p>
+            <w:r>
+              <w:rPr>
+                <w:sz w:val="19"/>
+              </w:rPr>
+              <w:t>82%</w:t>
+            </w:r>
+          </w:p>
+        </w:tc>
+        <w:tc>
+          <w:tcPr>
+            <w:tcW w:type="dxa" w:w="1728"/>
+          </w:tcPr>
+          <w:p>
+            <w:r>
+              <w:rPr>
+                <w:sz w:val="19"/>
+              </w:rPr>
+              <w:t>222 words</w:t>
+            </w:r>
+          </w:p>
+        </w:tc>
+      </w:tr>
+      <w:tr>
+        <w:tc>
+          <w:tcPr>
+            <w:tcW w:type="dxa" w:w="1728"/>
+          </w:tcPr>
+          <w:p>
+            <w:r>
+              <w:rPr>
+                <w:b/>
+                <w:sz w:val="19"/>
+              </w:rPr>
+              <w:t>Below-median depth</w:t>
+            </w:r>
+          </w:p>
+        </w:tc>
+        <w:tc>
+          <w:tcPr>
+            <w:tcW w:type="dxa" w:w="1728"/>
+          </w:tcPr>
+          <w:p>
+            <w:r>
+              <w:rPr>
+                <w:sz w:val="19"/>
+              </w:rPr>
+              <w:t>716</w:t>
+            </w:r>
+          </w:p>
+        </w:tc>
+        <w:tc>
+          <w:tcPr>
+            <w:tcW w:type="dxa" w:w="1728"/>
+          </w:tcPr>
+          <w:p>
+            <w:r>
+              <w:rPr>
+                <w:sz w:val="19"/>
+              </w:rPr>
+              <w:t>55%</w:t>
+            </w:r>
+          </w:p>
+        </w:tc>
+        <w:tc>
+          <w:tcPr>
+            <w:tcW w:type="dxa" w:w="1728"/>
+          </w:tcPr>
+          <w:p>
+            <w:r>
+              <w:rPr>
+                <w:sz w:val="19"/>
+              </w:rPr>
+              <w:t>74%</w:t>
+            </w:r>
+          </w:p>
+        </w:tc>
+        <w:tc>
+          <w:tcPr>
+            <w:tcW w:type="dxa" w:w="1728"/>
+          </w:tcPr>
+          <w:p>
+            <w:r>
+              <w:rPr>
+                <w:sz w:val="19"/>
+              </w:rPr>
+              <w:t>80 words</w:t>
+            </w:r>
+          </w:p>
+        </w:tc>
+      </w:tr>
+    </w:tbl>
+    <w:p>
+      <w:pPr>
+        <w:spacing w:after="40"/>
+      </w:pPr>
+    </w:p>
+    <w:p>
+      <w:pPr>
+        <w:spacing w:after="120"/>
+      </w:pPr>
+      <w:r>
+        <w:rPr>
+          <w:b w:val="0"/>
+        </w:rPr>
+        <w:t xml:space="preserve">That is a </w:t>
+      </w:r>
+      <w:r>
+        <w:rPr>
+          <w:b/>
+        </w:rPr>
+        <w:t>6-point</w:t>
+      </w:r>
+      <w:r>
+        <w:rPr>
+          <w:b w:val="0"/>
+        </w:rPr>
+        <w:t xml:space="preserve"> difference on the like-for-like measure (74% vs 82% on the looser "finished ≥1" reading). It is a real association and the strongest early signal available, but it is modest, and the deeper group is also in more cohorts — so treat first-interview support as the leading hypothesis to </w:t>
+      </w:r>
+      <w:r>
+        <w:rPr>
+          <w:b/>
+        </w:rPr>
+        <w:t>test</w:t>
+      </w:r>
+      <w:r>
+        <w:rPr>
+          <w:b w:val="0"/>
+        </w:rPr>
+        <w:t>, not an established lever.</w:t>
+      </w:r>
+    </w:p>
+    <w:p>
+      <w:pPr>
+        <w:pStyle w:val="Heading1"/>
+      </w:pPr>
+      <w:r>
+        <w:rPr>
+          <w:color w:val="1F3864"/>
+        </w:rPr>
+        <w:t>5. Geography and partner — one finding, not two</w:t>
+      </w:r>
+    </w:p>
+    <w:tbl>
+      <w:tblPr>
+        <w:tblStyle w:val="LightGrid-Accent1"/>
+        <w:tblW w:type="auto" w:w="0"/>
+        <w:tblLook w:firstColumn="1" w:firstRow="1" w:lastColumn="0" w:lastRow="0" w:noHBand="0" w:noVBand="1" w:val="04A0"/>
+      </w:tblPr>
+      <w:tblGrid>
+        <w:gridCol w:w="1728"/>
+        <w:gridCol w:w="1728"/>
+        <w:gridCol w:w="1728"/>
+        <w:gridCol w:w="1728"/>
+        <w:gridCol w:w="1728"/>
+      </w:tblGrid>
+      <w:tr>
+        <w:tc>
+          <w:tcPr>
+            <w:tcW w:type="dxa" w:w="1728"/>
           </w:tcPr>
           <w:p>
             <w:r>
@@ -1718,7 +2145,7 @@
         </w:tc>
         <w:tc>
           <w:tcPr>
-            <w:tcW w:type="dxa" w:w="2880"/>
+            <w:tcW w:type="dxa" w:w="1728"/>
           </w:tcPr>
           <w:p>
             <w:r>
@@ -1732,7 +2159,7 @@
         </w:tc>
         <w:tc>
           <w:tcPr>
-            <w:tcW w:type="dxa" w:w="2880"/>
+            <w:tcW w:type="dxa" w:w="1728"/>
           </w:tcPr>
           <w:p>
             <w:r>
@@ -1740,7 +2167,35 @@
                 <w:b/>
                 <w:sz w:val="19"/>
               </w:rPr>
-              <w:t>Finish rate</w:t>
+              <w:t>Per-cohort finish rate</w:t>
+            </w:r>
+          </w:p>
+        </w:tc>
+        <w:tc>
+          <w:tcPr>
+            <w:tcW w:type="dxa" w:w="1728"/>
+          </w:tcPr>
+          <w:p>
+            <w:r>
+              <w:rPr>
+                <w:b/>
+                <w:sz w:val="19"/>
+              </w:rPr>
+              <w:t>Finished ≥1 schedule</w:t>
+            </w:r>
+          </w:p>
+        </w:tc>
+        <w:tc>
+          <w:tcPr>
+            <w:tcW w:type="dxa" w:w="1728"/>
+          </w:tcPr>
+          <w:p>
+            <w:r>
+              <w:rPr>
+                <w:b/>
+                <w:sz w:val="19"/>
+              </w:rPr>
+              <w:t>Answer depth</w:t>
             </w:r>
           </w:p>
         </w:tc>
@@ -1748,7 +2203,7 @@
       <w:tr>
         <w:tc>
           <w:tcPr>
-            <w:tcW w:type="dxa" w:w="2880"/>
+            <w:tcW w:type="dxa" w:w="1728"/>
           </w:tcPr>
           <w:p>
             <w:r>
@@ -1762,7 +2217,7 @@
         </w:tc>
         <w:tc>
           <w:tcPr>
-            <w:tcW w:type="dxa" w:w="2880"/>
+            <w:tcW w:type="dxa" w:w="1728"/>
           </w:tcPr>
           <w:p>
             <w:r>
@@ -1775,7 +2230,20 @@
         </w:tc>
         <w:tc>
           <w:tcPr>
-            <w:tcW w:type="dxa" w:w="2880"/>
+            <w:tcW w:type="dxa" w:w="1728"/>
+          </w:tcPr>
+          <w:p>
+            <w:r>
+              <w:rPr>
+                <w:sz w:val="19"/>
+              </w:rPr>
+              <w:t>65%</w:t>
+            </w:r>
+          </w:p>
+        </w:tc>
+        <w:tc>
+          <w:tcPr>
+            <w:tcW w:type="dxa" w:w="1728"/>
           </w:tcPr>
           <w:p>
             <w:r>
@@ -1786,11 +2254,24 @@
             </w:r>
           </w:p>
         </w:tc>
+        <w:tc>
+          <w:tcPr>
+            <w:tcW w:type="dxa" w:w="1728"/>
+          </w:tcPr>
+          <w:p>
+            <w:r>
+              <w:rPr>
+                <w:sz w:val="19"/>
+              </w:rPr>
+              <w:t>237 words</w:t>
+            </w:r>
+          </w:p>
+        </w:tc>
       </w:tr>
       <w:tr>
         <w:tc>
           <w:tcPr>
-            <w:tcW w:type="dxa" w:w="2880"/>
+            <w:tcW w:type="dxa" w:w="1728"/>
           </w:tcPr>
           <w:p>
             <w:r>
@@ -1804,7 +2285,7 @@
         </w:tc>
         <w:tc>
           <w:tcPr>
-            <w:tcW w:type="dxa" w:w="2880"/>
+            <w:tcW w:type="dxa" w:w="1728"/>
           </w:tcPr>
           <w:p>
             <w:r>
@@ -1817,7 +2298,20 @@
         </w:tc>
         <w:tc>
           <w:tcPr>
-            <w:tcW w:type="dxa" w:w="2880"/>
+            <w:tcW w:type="dxa" w:w="1728"/>
+          </w:tcPr>
+          <w:p>
+            <w:r>
+              <w:rPr>
+                <w:sz w:val="19"/>
+              </w:rPr>
+              <w:t>64%</w:t>
+            </w:r>
+          </w:p>
+        </w:tc>
+        <w:tc>
+          <w:tcPr>
+            <w:tcW w:type="dxa" w:w="1728"/>
           </w:tcPr>
           <w:p>
             <w:r>
@@ -1828,11 +2322,24 @@
             </w:r>
           </w:p>
         </w:tc>
+        <w:tc>
+          <w:tcPr>
+            <w:tcW w:type="dxa" w:w="1728"/>
+          </w:tcPr>
+          <w:p>
+            <w:r>
+              <w:rPr>
+                <w:sz w:val="19"/>
+              </w:rPr>
+              <w:t>256 words</w:t>
+            </w:r>
+          </w:p>
+        </w:tc>
       </w:tr>
       <w:tr>
         <w:tc>
           <w:tcPr>
-            <w:tcW w:type="dxa" w:w="2880"/>
+            <w:tcW w:type="dxa" w:w="1728"/>
           </w:tcPr>
           <w:p>
             <w:r>
@@ -1846,7 +2353,7 @@
         </w:tc>
         <w:tc>
           <w:tcPr>
-            <w:tcW w:type="dxa" w:w="2880"/>
+            <w:tcW w:type="dxa" w:w="1728"/>
           </w:tcPr>
           <w:p>
             <w:r>
@@ -1859,7 +2366,20 @@
         </w:tc>
         <w:tc>
           <w:tcPr>
-            <w:tcW w:type="dxa" w:w="2880"/>
+            <w:tcW w:type="dxa" w:w="1728"/>
+          </w:tcPr>
+          <w:p>
+            <w:r>
+              <w:rPr>
+                <w:sz w:val="19"/>
+              </w:rPr>
+              <w:t>56%</w:t>
+            </w:r>
+          </w:p>
+        </w:tc>
+        <w:tc>
+          <w:tcPr>
+            <w:tcW w:type="dxa" w:w="1728"/>
           </w:tcPr>
           <w:p>
             <w:r>
@@ -1870,11 +2390,24 @@
             </w:r>
           </w:p>
         </w:tc>
+        <w:tc>
+          <w:tcPr>
+            <w:tcW w:type="dxa" w:w="1728"/>
+          </w:tcPr>
+          <w:p>
+            <w:r>
+              <w:rPr>
+                <w:sz w:val="19"/>
+              </w:rPr>
+              <w:t>230 words</w:t>
+            </w:r>
+          </w:p>
+        </w:tc>
       </w:tr>
       <w:tr>
         <w:tc>
           <w:tcPr>
-            <w:tcW w:type="dxa" w:w="2880"/>
+            <w:tcW w:type="dxa" w:w="1728"/>
           </w:tcPr>
           <w:p>
             <w:r>
@@ -1888,7 +2421,7 @@
         </w:tc>
         <w:tc>
           <w:tcPr>
-            <w:tcW w:type="dxa" w:w="2880"/>
+            <w:tcW w:type="dxa" w:w="1728"/>
           </w:tcPr>
           <w:p>
             <w:r>
@@ -1901,7 +2434,20 @@
         </w:tc>
         <w:tc>
           <w:tcPr>
-            <w:tcW w:type="dxa" w:w="2880"/>
+            <w:tcW w:type="dxa" w:w="1728"/>
+          </w:tcPr>
+          <w:p>
+            <w:r>
+              <w:rPr>
+                <w:sz w:val="19"/>
+              </w:rPr>
+              <w:t>42%</w:t>
+            </w:r>
+          </w:p>
+        </w:tc>
+        <w:tc>
+          <w:tcPr>
+            <w:tcW w:type="dxa" w:w="1728"/>
           </w:tcPr>
           <w:p>
             <w:r>
@@ -1909,6 +2455,246 @@
                 <w:sz w:val="19"/>
               </w:rPr>
               <w:t>58%</w:t>
+            </w:r>
+          </w:p>
+        </w:tc>
+        <w:tc>
+          <w:tcPr>
+            <w:tcW w:type="dxa" w:w="1728"/>
+          </w:tcPr>
+          <w:p>
+            <w:r>
+              <w:rPr>
+                <w:sz w:val="19"/>
+              </w:rPr>
+              <w:t>172 words</w:t>
+            </w:r>
+          </w:p>
+        </w:tc>
+      </w:tr>
+    </w:tbl>
+    <w:p>
+      <w:pPr>
+        <w:spacing w:after="40"/>
+      </w:pPr>
+    </w:p>
+    <w:tbl>
+      <w:tblPr>
+        <w:tblStyle w:val="LightGrid-Accent1"/>
+        <w:tblW w:type="auto" w:w="0"/>
+        <w:tblLook w:firstColumn="1" w:firstRow="1" w:lastColumn="0" w:lastRow="0" w:noHBand="0" w:noVBand="1" w:val="04A0"/>
+      </w:tblPr>
+      <w:tblGrid>
+        <w:gridCol w:w="1728"/>
+        <w:gridCol w:w="1728"/>
+        <w:gridCol w:w="1728"/>
+        <w:gridCol w:w="1728"/>
+        <w:gridCol w:w="1728"/>
+      </w:tblGrid>
+      <w:tr>
+        <w:tc>
+          <w:tcPr>
+            <w:tcW w:type="dxa" w:w="1728"/>
+          </w:tcPr>
+          <w:p>
+            <w:r>
+              <w:rPr>
+                <w:b/>
+                <w:sz w:val="19"/>
+              </w:rPr>
+              <w:t>Implementing partner</w:t>
+            </w:r>
+          </w:p>
+        </w:tc>
+        <w:tc>
+          <w:tcPr>
+            <w:tcW w:type="dxa" w:w="1728"/>
+          </w:tcPr>
+          <w:p>
+            <w:r>
+              <w:rPr>
+                <w:b/>
+                <w:sz w:val="19"/>
+              </w:rPr>
+              <w:t>Workers</w:t>
+            </w:r>
+          </w:p>
+        </w:tc>
+        <w:tc>
+          <w:tcPr>
+            <w:tcW w:type="dxa" w:w="1728"/>
+          </w:tcPr>
+          <w:p>
+            <w:r>
+              <w:rPr>
+                <w:b/>
+                <w:sz w:val="19"/>
+              </w:rPr>
+              <w:t>Per-cohort finish rate</w:t>
+            </w:r>
+          </w:p>
+        </w:tc>
+        <w:tc>
+          <w:tcPr>
+            <w:tcW w:type="dxa" w:w="1728"/>
+          </w:tcPr>
+          <w:p>
+            <w:r>
+              <w:rPr>
+                <w:b/>
+                <w:sz w:val="19"/>
+              </w:rPr>
+              <w:t>Finished ≥1 schedule</w:t>
+            </w:r>
+          </w:p>
+        </w:tc>
+        <w:tc>
+          <w:tcPr>
+            <w:tcW w:type="dxa" w:w="1728"/>
+          </w:tcPr>
+          <w:p>
+            <w:r>
+              <w:rPr>
+                <w:b/>
+                <w:sz w:val="19"/>
+              </w:rPr>
+              <w:t>Answer depth</w:t>
+            </w:r>
+          </w:p>
+        </w:tc>
+      </w:tr>
+      <w:tr>
+        <w:tc>
+          <w:tcPr>
+            <w:tcW w:type="dxa" w:w="1728"/>
+          </w:tcPr>
+          <w:p>
+            <w:r>
+              <w:rPr>
+                <w:b/>
+                <w:sz w:val="19"/>
+              </w:rPr>
+              <w:t>COWACDI</w:t>
+            </w:r>
+          </w:p>
+        </w:tc>
+        <w:tc>
+          <w:tcPr>
+            <w:tcW w:type="dxa" w:w="1728"/>
+          </w:tcPr>
+          <w:p>
+            <w:r>
+              <w:rPr>
+                <w:sz w:val="19"/>
+              </w:rPr>
+              <w:t>765</w:t>
+            </w:r>
+          </w:p>
+        </w:tc>
+        <w:tc>
+          <w:tcPr>
+            <w:tcW w:type="dxa" w:w="1728"/>
+          </w:tcPr>
+          <w:p>
+            <w:r>
+              <w:rPr>
+                <w:sz w:val="19"/>
+              </w:rPr>
+              <w:t>65%</w:t>
+            </w:r>
+          </w:p>
+        </w:tc>
+        <w:tc>
+          <w:tcPr>
+            <w:tcW w:type="dxa" w:w="1728"/>
+          </w:tcPr>
+          <w:p>
+            <w:r>
+              <w:rPr>
+                <w:sz w:val="19"/>
+              </w:rPr>
+              <w:t>86%</w:t>
+            </w:r>
+          </w:p>
+        </w:tc>
+        <w:tc>
+          <w:tcPr>
+            <w:tcW w:type="dxa" w:w="1728"/>
+          </w:tcPr>
+          <w:p>
+            <w:r>
+              <w:rPr>
+                <w:sz w:val="19"/>
+              </w:rPr>
+              <w:t>247 words</w:t>
+            </w:r>
+          </w:p>
+        </w:tc>
+      </w:tr>
+      <w:tr>
+        <w:tc>
+          <w:tcPr>
+            <w:tcW w:type="dxa" w:w="1728"/>
+          </w:tcPr>
+          <w:p>
+            <w:r>
+              <w:rPr>
+                <w:b/>
+                <w:sz w:val="19"/>
+              </w:rPr>
+              <w:t>EHA</w:t>
+            </w:r>
+          </w:p>
+        </w:tc>
+        <w:tc>
+          <w:tcPr>
+            <w:tcW w:type="dxa" w:w="1728"/>
+          </w:tcPr>
+          <w:p>
+            <w:r>
+              <w:rPr>
+                <w:sz w:val="19"/>
+              </w:rPr>
+              <w:t>675</w:t>
+            </w:r>
+          </w:p>
+        </w:tc>
+        <w:tc>
+          <w:tcPr>
+            <w:tcW w:type="dxa" w:w="1728"/>
+          </w:tcPr>
+          <w:p>
+            <w:r>
+              <w:rPr>
+                <w:sz w:val="19"/>
+              </w:rPr>
+              <w:t>50%</w:t>
+            </w:r>
+          </w:p>
+        </w:tc>
+        <w:tc>
+          <w:tcPr>
+            <w:tcW w:type="dxa" w:w="1728"/>
+          </w:tcPr>
+          <w:p>
+            <w:r>
+              <w:rPr>
+                <w:sz w:val="19"/>
+              </w:rPr>
+              <w:t>69%</w:t>
+            </w:r>
+          </w:p>
+        </w:tc>
+        <w:tc>
+          <w:tcPr>
+            <w:tcW w:type="dxa" w:w="1728"/>
+          </w:tcPr>
+          <w:p>
+            <w:r>
+              <w:rPr>
+                <w:sz w:val="19"/>
+              </w:rPr>
+              <w:t>205 words</w:t>
             </w:r>
           </w:p>
         </w:tc>
@@ -1921,62 +2707,83 @@
     </w:p>
     <w:p>
       <w:pPr>
-        <w:pStyle w:val="ListBullet"/>
-        <w:spacing w:after="60"/>
+        <w:spacing w:after="120"/>
       </w:pPr>
       <w:r>
         <w:rPr>
           <w:b w:val="0"/>
         </w:rPr>
-        <w:t xml:space="preserve">By implementing partner (LLO): COWACDI </w:t>
+        <w:t xml:space="preserve">These two tables are </w:t>
       </w:r>
       <w:r>
         <w:rPr>
           <w:b/>
         </w:rPr>
-        <w:t>86%</w:t>
+        <w:t>the same finding cut two ways</w:t>
       </w:r>
       <w:r>
         <w:rPr>
           <w:b w:val="0"/>
         </w:rPr>
-        <w:t xml:space="preserve"> vs EHA </w:t>
+        <w:t>. In this data the partners and the states are nested (</w:t>
       </w:r>
       <w:r>
         <w:rPr>
           <w:b/>
         </w:rPr>
-        <w:t>69%</w:t>
+        <w:t>COWACDI</w:t>
       </w:r>
       <w:r>
         <w:rPr>
           <w:b w:val="0"/>
         </w:rPr>
-        <w:t xml:space="preserve"> finish — the cohort-level gap confirmed at the worker level; workers spanning both partners finish ~100%.</w:t>
+        <w:t xml:space="preserve"> serves Borno and Kebbi; </w:t>
+      </w:r>
+      <w:r>
+        <w:rPr>
+          <w:b/>
+        </w:rPr>
+        <w:t>EHA</w:t>
+      </w:r>
+      <w:r>
+        <w:rPr>
+          <w:b w:val="0"/>
+        </w:rPr>
+        <w:t xml:space="preserve"> serves Bauchi and Sokoto), so a state's result and its partner's result are the same observation — the data cannot tell you whether the difference is geography, the partner's ways of working, or something the two share. Treat "the EHA gap" and "the Sokoto gap" as one issue, and do not count them as two independent findings or give them two separate workstreams.</w:t>
       </w:r>
     </w:p>
     <w:p>
       <w:pPr>
-        <w:pStyle w:val="ListBullet"/>
-        <w:spacing w:after="60"/>
+        <w:spacing w:after="120"/>
       </w:pPr>
       <w:r>
         <w:rPr>
           <w:b w:val="0"/>
         </w:rPr>
-        <w:t xml:space="preserve">By FLW cadre: chv leads at 87%; the largest cadre, </w:t>
+        <w:t>The spread is wide: Borno 65% vs Sokoto 42% per-cohort — 23 points.</w:t>
+      </w:r>
+    </w:p>
+    <w:p>
+      <w:pPr>
+        <w:spacing w:after="120"/>
+      </w:pPr>
+      <w:r>
+        <w:rPr>
+          <w:b w:val="0"/>
+        </w:rPr>
+        <w:t xml:space="preserve">By cadre, results are much tighter: 52–65% per-cohort across 8 cadres. The largest is </w:t>
       </w:r>
       <w:r>
         <w:rPr>
           <w:b/>
         </w:rPr>
-        <w:t>“chew” (558 workers) at 75%</w:t>
+        <w:t>chew (558 workers) at 56%</w:t>
       </w:r>
       <w:r>
         <w:rPr>
           <w:b w:val="0"/>
         </w:rPr>
-        <w:t xml:space="preserve"> — mid-pack but, by size, the single biggest opportunity to lift the average.</w:t>
+        <w:t>. Because the cadre spread is narrow while the geography spread is wide, cadre looks like the weaker lever of the two.</w:t>
       </w:r>
     </w:p>
     <w:p>
@@ -1998,13 +2805,51 @@
         <w:rPr>
           <w:b/>
         </w:rPr>
-        <w:t>51 workers</w:t>
+        <w:t>27 workers</w:t>
       </w:r>
       <w:r>
         <w:rPr>
           <w:b w:val="0"/>
         </w:rPr>
-        <w:t xml:space="preserve"> started, haven't finished, and have been silent 14–60 days — recent enough to re-engage. Concentrated in Sokoto (20), Bauchi (18), Kebbi (7), Borno (6). A small, concrete outreach list; a targeted nudge here is high-yield.</w:t>
+        <w:t xml:space="preserve"> started, have not finished any schedule, </w:t>
+      </w:r>
+      <w:r>
+        <w:rPr>
+          <w:b/>
+        </w:rPr>
+        <w:t>were</w:t>
+      </w:r>
+      <w:r>
+        <w:rPr>
+          <w:b w:val="0"/>
+        </w:rPr>
+        <w:t xml:space="preserve"> offered a complete schedule, and have been silent 14–60 days — recent enough that a nudge is plausible. Concentrated in Sokoto (12), Bauchi (9), Kebbi (4), Borno (2). They are the recent slice of </w:t>
+      </w:r>
+      <w:r>
+        <w:rPr>
+          <w:b/>
+        </w:rPr>
+        <w:t>316</w:t>
+      </w:r>
+      <w:r>
+        <w:rPr>
+          <w:b w:val="0"/>
+        </w:rPr>
+        <w:t xml:space="preserve"> unfinished workers, not the whole unfinished population — the rest have been silent longer than 60 days.</w:t>
+      </w:r>
+    </w:p>
+    <w:p>
+      <w:pPr>
+        <w:spacing w:after="120"/>
+      </w:pPr>
+      <w:r>
+        <w:rPr>
+          <w:b w:val="0"/>
+          <w:i/>
+          <w:color w:val="6B7280"/>
+          <w:sz w:val="19"/>
+        </w:rPr>
+        <w:t>Two caveats: the list is defined off the newest session in the dataset, so it moves as data refreshes; and it deliberately excludes workers the programme never finished triggering, who are unfinished through no choice of their own.</w:t>
       </w:r>
     </w:p>
     <w:p>
@@ -2015,7 +2860,7 @@
         <w:rPr>
           <w:color w:val="1F3864"/>
         </w:rPr>
-        <w:t>7. Recommendations</w:t>
+        <w:t>7. What to do — and how confident we are</w:t>
       </w:r>
     </w:p>
     <w:p>
@@ -2025,9 +2870,15 @@
       </w:pPr>
       <w:r>
         <w:rPr>
+          <w:b/>
+        </w:rPr>
+        <w:t>Run the 27-worker recovery list now.</w:t>
+      </w:r>
+      <w:r>
+        <w:rPr>
           <w:b w:val="0"/>
         </w:rPr>
-        <w:t>Make the first interview the priority — the strongest retention lever. Invest in prompt quality, length, and first-touch support, especially for first-time workers.</w:t>
+        <w:t xml:space="preserve"> Small, named, and time-bounded — the only directly actionable item here. Confidence: high, it is a list, not an inference.</w:t>
       </w:r>
     </w:p>
     <w:p>
@@ -2037,9 +2888,15 @@
       </w:pPr>
       <w:r>
         <w:rPr>
+          <w:b/>
+        </w:rPr>
+        <w:t>Trial first-interview support, with a control group.</w:t>
+      </w:r>
+      <w:r>
+        <w:rPr>
           <w:b w:val="0"/>
         </w:rPr>
-        <w:t>Lean into worker re-use — re-inviting proven workers compounds engagement. Build a returning-worker panel rather than defaulting to fresh single-exposure recruitment.</w:t>
+        <w:t xml:space="preserve"> Above-median first-session depth is associated with a 6-point higher per-cohort finish rate. Confidence: moderate — real association, modest size, confounded with cohort count, so measure it rather than rolling it out.</w:t>
       </w:r>
     </w:p>
     <w:p>
@@ -2049,9 +2906,15 @@
       </w:pPr>
       <w:r>
         <w:rPr>
+          <w:b/>
+        </w:rPr>
+        <w:t>Treat the Sokoto / EHA gap as one investigation.</w:t>
+      </w:r>
+      <w:r>
+        <w:rPr>
           <w:b w:val="0"/>
         </w:rPr>
-        <w:t>Target Sokoto and the “chew” cadre — where one-and-done concentrates. Pair them with the onboarding support that works elsewhere.</w:t>
+        <w:t xml:space="preserve"> It is the largest effect in the data (23 points) and it is where one-and-done concentrates. Confidence: high that the gap is real, none at all on the cause — geography and partner cannot be separated here, so the next step is qualitative, not another cut of this data.</w:t>
       </w:r>
     </w:p>
     <w:p>
@@ -2061,21 +2924,15 @@
       </w:pPr>
       <w:r>
         <w:rPr>
-          <w:b w:val="0"/>
+          <w:b/>
         </w:rPr>
-        <w:t>Run the 51-worker recovery list now — the fastest available win.</w:t>
+        <w:t>Keep re-using proven workers for operational reasons</w:t>
       </w:r>
-    </w:p>
-    <w:p>
-      <w:pPr>
-        <w:pStyle w:val="ListNumber"/>
-        <w:spacing w:after="60"/>
-      </w:pPr>
       <w:r>
         <w:rPr>
           <w:b w:val="0"/>
         </w:rPr>
-        <w:t>Investigate the EHA gap — COWACDI retains ~17 points better; understanding why could lift EHA materially.</w:t>
+        <w:t xml:space="preserve"> — known, trained, available, and they answer at greater length. Confidence: high on the operational value; do not forecast a finish-rate gain from re-use itself, because the headline gap is mostly arithmetic and re-invitation is itself an outcome of past performance.</w:t>
       </w:r>
     </w:p>
     <w:p>
@@ -2096,9 +2953,15 @@
       </w:pPr>
       <w:r>
         <w:rPr>
+          <w:b/>
+        </w:rPr>
+        <w:t>Grain:</w:t>
+      </w:r>
+      <w:r>
+        <w:rPr>
           <w:b w:val="0"/>
         </w:rPr>
-        <w:t>Grain: one row per unique worker (connect_id), deduped across cohorts; metrics union the worker's sessions across every arm. Ties out to the canonical started-worker count.</w:t>
+        <w:t xml:space="preserve"> one row per unique worker (connect_id), deduped across cohorts; metrics union the worker's sessions across every arm. Ties out to the dashboard's canonical started-worker count (1,441).</w:t>
       </w:r>
     </w:p>
     <w:p>
@@ -2108,9 +2971,15 @@
       </w:pPr>
       <w:r>
         <w:rPr>
+          <w:b/>
+        </w:rPr>
+        <w:t>Per-cohort finish rate</w:t>
+      </w:r>
+      <w:r>
+        <w:rPr>
           <w:b w:val="0"/>
         </w:rPr>
-        <w:t>Engagement tier (RFM): Recency + completion rate + answer depth, each 1–5. Persona: rule-based behavioral segment. Finished: completed all scheduled interviews in ≥1 cohort.</w:t>
+        <w:t xml:space="preserve"> — the measure to quote. Of all the cohort schedules a worker was enrolled in, the share they completed. Unlike "finished ≥1 schedule", it does not rise just because a worker was in more cohorts.</w:t>
       </w:r>
     </w:p>
     <w:p>
@@ -2120,9 +2989,15 @@
       </w:pPr>
       <w:r>
         <w:rPr>
+          <w:b/>
+        </w:rPr>
+        <w:t>Depth curve</w:t>
+      </w:r>
+      <w:r>
+        <w:rPr>
           <w:b w:val="0"/>
         </w:rPr>
-        <w:t>Sources: CommCare trigger + session data · OCS sessions (depth) · Connect funnel · flw_registration demographics. Full per-worker detail: flw_analysis.csv. Live: dashboard → FLW Retention tab (daily). This document is generated from the same payload, so it always matches the dashboard.</w:t>
+        <w:t xml:space="preserve"> is quoted against the workers whose schedule contains that interview, not the whole population, so a 2-interview worker is not counted as dropping out at interview 3.</w:t>
       </w:r>
     </w:p>
     <w:p>
@@ -2132,9 +3007,81 @@
       </w:pPr>
       <w:r>
         <w:rPr>
+          <w:b/>
+        </w:rPr>
+        <w:t>Engagement tier (RFM):</w:t>
+      </w:r>
+      <w:r>
+        <w:rPr>
           <w:b w:val="0"/>
         </w:rPr>
-        <w:t>Caveats: multi-cohort “finished” share is upward-biased (§2; completion &amp; depth agree and are unbiased); progression-depth conflates schedule lengths (§3); experience_years unreliable and excluded.</w:t>
+        <w:t xml:space="preserve"> recency + completion rate + answer depth, each scored 1–5, with recency measured against the freshest session in the dataset rather than today's date.</w:t>
+      </w:r>
+    </w:p>
+    <w:p>
+      <w:pPr>
+        <w:pStyle w:val="ListBullet"/>
+        <w:spacing w:after="60"/>
+      </w:pPr>
+      <w:r>
+        <w:rPr>
+          <w:b/>
+        </w:rPr>
+        <w:t>Personas</w:t>
+      </w:r>
+      <w:r>
+        <w:rPr>
+          <w:b w:val="0"/>
+        </w:rPr>
+        <w:t xml:space="preserve"> are rule-based. "Partial progress" means over half of triggered interviews completed but </w:t>
+      </w:r>
+      <w:r>
+        <w:rPr>
+          <w:b/>
+        </w:rPr>
+        <w:t>no</w:t>
+      </w:r>
+      <w:r>
+        <w:rPr>
+          <w:b w:val="0"/>
+        </w:rPr>
+        <w:t xml:space="preserve"> schedule finished — it is not a slow finisher.</w:t>
+      </w:r>
+    </w:p>
+    <w:p>
+      <w:pPr>
+        <w:pStyle w:val="ListBullet"/>
+        <w:spacing w:after="60"/>
+      </w:pPr>
+      <w:r>
+        <w:rPr>
+          <w:b/>
+        </w:rPr>
+        <w:t>Limits.</w:t>
+      </w:r>
+      <w:r>
+        <w:rPr>
+          <w:b w:val="0"/>
+        </w:rPr>
+        <w:t xml:space="preserve"> Observational, so associations only. Small groups are pooled into an "Other / not recorded" row rather than dropped or published as their own rate. Figures move with each daily refresh; this document is generated from dashboard render v146.</w:t>
+      </w:r>
+    </w:p>
+    <w:p>
+      <w:pPr>
+        <w:pStyle w:val="ListBullet"/>
+        <w:spacing w:after="60"/>
+      </w:pPr>
+      <w:r>
+        <w:rPr>
+          <w:b/>
+        </w:rPr>
+        <w:t>Full per-worker detail</w:t>
+      </w:r>
+      <w:r>
+        <w:rPr>
+          <w:b w:val="0"/>
+        </w:rPr>
+        <w:t xml:space="preserve"> is in the flw_analysis.csv export; the dashboard's FLW Retention tab is interactive.</w:t>
       </w:r>
     </w:p>
     <w:sectPr>

</xml_diff>

<commit_message>
docs(interviews): regenerate both briefs from live render v147 (renamed tiers)
Picks up the tier rename (Champion/Solid/At-risk -> Highly engaged/Engaged/Gone quiet) so the document
no longer uses "Champion" for both a tier and a persona, plus the new §1 paragraph stating that tiers
describe where a worker is right now while personas describe their whole history.

Verified in the .docx XML: all five new tier labels present, "Solid" and "At-risk" gone, "Champion"
appears only as a persona, the six disproven claims still absent, and the header stamps render v147.
--check exits 0.

Co-Authored-By: Claude Opus 5 <noreply@anthropic.com>
</commit_message>
<xml_diff>
--- a/docs/FLW_Retention_Analysis_Brief.docx
+++ b/docs/FLW_Retention_Analysis_Brief.docx
@@ -23,7 +23,7 @@
           <w:color w:val="6B7280"/>
           <w:sz w:val="19"/>
         </w:rPr>
-        <w:t>Connect Interviews programme · per-FLW, cross-cohort · data as of 2026-08-11 · build 2026-08-11 05:47 UTC · dashboard render v146</w:t>
+        <w:t>Connect Interviews programme · per-FLW, cross-cohort · data as of 2026-08-11 · build 2026-08-11 18:18 UTC · dashboard render v147</w:t>
       </w:r>
     </w:p>
     <w:p>
@@ -649,8 +649,76 @@
       <w:r>
         <w:rPr>
           <w:b w:val="0"/>
+          <w:i/>
+          <w:color w:val="6B7280"/>
+          <w:sz w:val="19"/>
         </w:rPr>
-        <w:t>Separately, engagement tiers blend recency, completion rate and answer depth: 61% sit in the top two tiers (Champion 21% + Solid 40%), 31% Slipping, 8% At-risk or Lost. "Slipping" is mixed: it holds both finishers who are simply inactive now and a large share of the one-and-done group, so it should not be read as uniformly benign. Tier recency is measured against the freshest session in the dataset rather than the wall clock, so these shares do not drift when a data pull runs late.</w:t>
+        <w:t xml:space="preserve">Engagement tiers answer a </w:t>
+      </w:r>
+      <w:r>
+        <w:rPr>
+          <w:b/>
+          <w:i/>
+          <w:color w:val="6B7280"/>
+          <w:sz w:val="19"/>
+        </w:rPr>
+        <w:t>different question</w:t>
+      </w:r>
+      <w:r>
+        <w:rPr>
+          <w:b w:val="0"/>
+          <w:i/>
+          <w:color w:val="6B7280"/>
+          <w:sz w:val="19"/>
+        </w:rPr>
+        <w:t xml:space="preserve"> from the personas above. A tier is where a worker sits </w:t>
+      </w:r>
+      <w:r>
+        <w:rPr>
+          <w:b/>
+          <w:i/>
+          <w:color w:val="6B7280"/>
+          <w:sz w:val="19"/>
+        </w:rPr>
+        <w:t>right now</w:t>
+      </w:r>
+      <w:r>
+        <w:rPr>
+          <w:b w:val="0"/>
+          <w:i/>
+          <w:color w:val="6B7280"/>
+          <w:sz w:val="19"/>
+        </w:rPr>
+        <w:t xml:space="preserve"> — a band blending how recently they interviewed with their completion rate and answer depth — so a worker moves between tiers over time. A persona describes their </w:t>
+      </w:r>
+      <w:r>
+        <w:rPr>
+          <w:b/>
+          <w:i/>
+          <w:color w:val="6B7280"/>
+          <w:sz w:val="19"/>
+        </w:rPr>
+        <w:t>whole history</w:t>
+      </w:r>
+      <w:r>
+        <w:rPr>
+          <w:b w:val="0"/>
+          <w:i/>
+          <w:color w:val="6B7280"/>
+          <w:sz w:val="19"/>
+        </w:rPr>
+        <w:t xml:space="preserve"> and does not move. The two use deliberately different words so they are never read as the same grouping.</w:t>
+      </w:r>
+    </w:p>
+    <w:p>
+      <w:pPr>
+        <w:spacing w:after="120"/>
+      </w:pPr>
+      <w:r>
+        <w:rPr>
+          <w:b w:val="0"/>
+        </w:rPr>
+        <w:t>On that basis: 61% sit in the top two tiers. Full spread — 21% Highly engaged, 40% Engaged, 31% Slipping, 7% Gone quiet, 1% Lost. "Slipping" is mixed: it holds both finishers who are simply inactive now and a large share of the one-and-done group, so it should not be read as uniformly benign. Tier recency is measured against the freshest session in the dataset rather than the wall clock, so these shares do not drift when a data pull runs late.</w:t>
       </w:r>
     </w:p>
     <w:p>
@@ -766,7 +834,7 @@
               <w:rPr>
                 <w:sz w:val="19"/>
               </w:rPr>
-              <w:t>332</w:t>
+              <w:t>331</w:t>
             </w:r>
           </w:p>
         </w:tc>
@@ -808,7 +876,7 @@
               <w:rPr>
                 <w:sz w:val="19"/>
               </w:rPr>
-              <w:t>599</w:t>
+              <w:t>600</w:t>
             </w:r>
           </w:p>
         </w:tc>
@@ -1314,7 +1382,7 @@
               <w:rPr>
                 <w:sz w:val="19"/>
               </w:rPr>
-              <w:t>332</w:t>
+              <w:t>331</w:t>
             </w:r>
           </w:p>
         </w:tc>
@@ -1327,7 +1395,7 @@
               <w:rPr>
                 <w:sz w:val="19"/>
               </w:rPr>
-              <w:t>1,109</w:t>
+              <w:t>1,110</w:t>
             </w:r>
           </w:p>
         </w:tc>
@@ -1805,7 +1873,7 @@
         <w:rPr>
           <w:b w:val="0"/>
         </w:rPr>
-        <w:t xml:space="preserve"> reach it (893 of 1,038). Quoting it against the whole population instead gives 62%, which understates retention because most workers are in short cohorts that stop before interview 3 — that is schedule length, not attrition. The clean worker-level attrition figure is the 9% one-and-done.</w:t>
+        <w:t xml:space="preserve"> reach it (893 of 1,039). Quoting it against the whole population instead gives 62%, which understates retention because most workers are in short cohorts that stop before interview 3 — that is schedule length, not attrition. The clean worker-level attrition figure is the 9% one-and-done.</w:t>
       </w:r>
     </w:p>
     <w:p>
@@ -3063,7 +3131,7 @@
         <w:rPr>
           <w:b w:val="0"/>
         </w:rPr>
-        <w:t xml:space="preserve"> Observational, so associations only. Small groups are pooled into an "Other / not recorded" row rather than dropped or published as their own rate. Figures move with each daily refresh; this document is generated from dashboard render v146.</w:t>
+        <w:t xml:space="preserve"> Observational, so associations only. Small groups are pooled into an "Other / not recorded" row rather than dropped or published as their own rate. Figures move with each daily refresh; this document is generated from dashboard render v147.</w:t>
       </w:r>
     </w:p>
     <w:p>

</xml_diff>

<commit_message>
docs(interviews): regenerate both brief variants from live render v151
Full brief (9 sections + method) and the findings-only cut, both from the same payload and code path.
--check exits 0.

Note on the publish: two runs were triggered back-to-back earlier, and the second failed because the
Connect refresh token rotates on use - run 1 wrote the new value back to the GH secret while run 2 had
already been queued with the old one, so it got 400 from /o/token/. HQ also returned almost nothing
(9s vs the usual ~316s), most likely rate-limited by run 1 minutes before. The build then aborted at
step 4 on an empty master rather than publishing degraded data, which is the intended behaviour.
Operational lesson: never trigger a second refresh while one is queued.

Co-Authored-By: Claude Opus 5 <noreply@anthropic.com>
</commit_message>
<xml_diff>
--- a/docs/FLW_Retention_Analysis_Brief.docx
+++ b/docs/FLW_Retention_Analysis_Brief.docx
@@ -23,7 +23,7 @@
           <w:color w:val="6B7280"/>
           <w:sz w:val="19"/>
         </w:rPr>
-        <w:t>Connect Interviews programme · per-FLW, cross-cohort · data as of 2026-08-11 · build 2026-08-11 20:48 UTC · dashboard render v149</w:t>
+        <w:t>Connect Interviews programme · per-FLW, cross-cohort · data as of 2026-08-11 · build 2026-08-11 21:51 UTC · dashboard render v151</w:t>
       </w:r>
     </w:p>
     <w:p>
@@ -936,7 +936,7 @@
               <w:rPr>
                 <w:sz w:val="19"/>
               </w:rPr>
-              <w:t>298</w:t>
+              <w:t>297</w:t>
             </w:r>
           </w:p>
         </w:tc>
@@ -978,7 +978,7 @@
               <w:rPr>
                 <w:sz w:val="19"/>
               </w:rPr>
-              <w:t>575</w:t>
+              <w:t>576</w:t>
             </w:r>
           </w:p>
         </w:tc>
@@ -2413,7 +2413,7 @@
         <w:rPr>
           <w:b w:val="0"/>
         </w:rPr>
-        <w:t xml:space="preserve"> — most of them engaged repeatedly first. So 9% is who we lost immediately; 22% is who has not got there yet. §6 draws its recovery list from the second group.</w:t>
+        <w:t xml:space="preserve"> — most of them engaged repeatedly first. So 9% is who we lost immediately; 22% is who has not got there yet. §8 draws its recovery list from the second group.</w:t>
       </w:r>
     </w:p>
     <w:p>
@@ -4677,7 +4677,7 @@
         <w:rPr>
           <w:b w:val="0"/>
         </w:rPr>
-        <w:t xml:space="preserve"> Observational, so associations only. Small groups are pooled into an "Other / not recorded" row rather than dropped or published as their own rate. Figures move with each daily refresh; this document is generated from dashboard render v149.</w:t>
+        <w:t xml:space="preserve"> Observational, so associations only. Small groups are pooled into an "Other / not recorded" row rather than dropped or published as their own rate. Figures move with each daily refresh; this document is generated from dashboard render v151.</w:t>
       </w:r>
     </w:p>
     <w:p>

</xml_diff>